<commit_message>
Update proposal docx and PDF, clean up obsolete draft files
</commit_message>
<xml_diff>
--- a/เค้าโครงโครงงานคอมพิวเตอร์.docx
+++ b/เค้าโครงโครงงานคอมพิวเตอร์.docx
@@ -700,10 +700,7 @@
       </w:r>
       <w:proofErr w:type="spellEnd"/>
       <w:r>
-        <w:t xml:space="preserve">  </w:t>
-      </w:r>
-      <w:r>
-        <w:t xml:space="preserve"> </w:t>
+        <w:t xml:space="preserve">   </w:t>
       </w:r>
       <w:proofErr w:type="spellStart"/>
       <w:r>
@@ -8462,7 +8459,7 @@
     <w:p>
       <w:pPr>
         <w:spacing w:after="240"/>
-        <w:jc w:val="center"/>
+        <w:ind w:left="709" w:hanging="709"/>
       </w:pPr>
       <w:proofErr w:type="spellStart"/>
       <w:r>
@@ -8478,68 +8475,67 @@
           <w:b/>
           <w:bCs/>
         </w:rPr>
+        <w:t xml:space="preserve"> 1</w:t>
+      </w:r>
+      <w:r>
+        <w:tab/>
+      </w:r>
+      <w:r>
+        <w:rPr>
+          <w:cs/>
+        </w:rPr>
+        <w:t xml:space="preserve">ตัวอย่างภาพ </w:t>
+      </w:r>
+      <w:r>
+        <w:t xml:space="preserve">Infiltration </w:t>
+      </w:r>
+      <w:r>
+        <w:rPr>
+          <w:cs/>
+        </w:rPr>
+        <w:t xml:space="preserve">จากชุดข้อมูล </w:t>
+      </w:r>
+      <w:proofErr w:type="spellStart"/>
+      <w:r>
+        <w:t>VinBigData</w:t>
+      </w:r>
+      <w:proofErr w:type="spellEnd"/>
+      <w:r>
         <w:t xml:space="preserve"> </w:t>
       </w:r>
-      <w:proofErr w:type="gramStart"/>
-      <w:r>
-        <w:rPr>
-          <w:b/>
-          <w:bCs/>
-        </w:rPr>
-        <w:t>1</w:t>
-      </w:r>
-      <w:r>
-        <w:t xml:space="preserve">  </w:t>
-      </w:r>
-      <w:proofErr w:type="spellStart"/>
-      <w:r>
-        <w:t>ตัวอย่างภาพ</w:t>
-      </w:r>
-      <w:proofErr w:type="spellEnd"/>
-      <w:proofErr w:type="gramEnd"/>
-      <w:r>
-        <w:t xml:space="preserve"> Infiltration </w:t>
-      </w:r>
-      <w:proofErr w:type="spellStart"/>
-      <w:r>
-        <w:t>จากชุดข้อมูล</w:t>
-      </w:r>
-      <w:proofErr w:type="spellEnd"/>
-      <w:r>
-        <w:t xml:space="preserve"> </w:t>
-      </w:r>
-      <w:proofErr w:type="spellStart"/>
-      <w:r>
-        <w:t>VinBigData</w:t>
-      </w:r>
-      <w:proofErr w:type="spellEnd"/>
-      <w:r>
-        <w:t xml:space="preserve"> </w:t>
-      </w:r>
-      <w:proofErr w:type="spellStart"/>
-      <w:r>
-        <w:t>ที่เติม</w:t>
-      </w:r>
-      <w:proofErr w:type="spellEnd"/>
-      <w:r>
-        <w:t xml:space="preserve"> Gaussian Noise </w:t>
-      </w:r>
-      <w:proofErr w:type="spellStart"/>
-      <w:r>
-        <w:t>ระดับ</w:t>
-      </w:r>
-      <w:proofErr w:type="spellEnd"/>
-      <w:r>
-        <w:t xml:space="preserve"> N2 </w:t>
-      </w:r>
-      <w:proofErr w:type="spellStart"/>
-      <w:r>
-        <w:t>และผลจากวิธีลดสัญญาณรบกวนแต่ละวิธีในการทดลองที่</w:t>
-      </w:r>
-      <w:proofErr w:type="spellEnd"/>
-      <w:r>
-        <w:t xml:space="preserve"> 2</w:t>
-      </w:r>
+      <w:r>
+        <w:rPr>
+          <w:cs/>
+        </w:rPr>
+        <w:t xml:space="preserve">ที่เติม </w:t>
+      </w:r>
+      <w:r>
+        <w:t xml:space="preserve">Gaussian Noise </w:t>
+      </w:r>
+      <w:r>
+        <w:rPr>
+          <w:cs/>
+        </w:rPr>
+        <w:t xml:space="preserve">ระดับ </w:t>
+      </w:r>
+      <w:r>
+        <w:t xml:space="preserve">N2 </w:t>
+      </w:r>
+      <w:r>
+        <w:rPr>
+          <w:cs/>
+        </w:rPr>
+        <w:t xml:space="preserve">และผลจากวิธีลดสัญญาณรบกวนแต่ละวิธีในการทดลองที่ </w:t>
+      </w:r>
+      <w:r>
+        <w:t>2</w:t>
+      </w:r>
+    </w:p>
+    <w:p>
+      <w:pPr>
+        <w:spacing w:after="240"/>
+        <w:ind w:left="709" w:hanging="709"/>
+      </w:pPr>
     </w:p>
     <w:p>
       <w:pPr>
@@ -8548,6 +8544,7 @@
         <w:ind w:left="360"/>
       </w:pPr>
       <w:r>
+        <w:lastRenderedPageBreak/>
         <w:t xml:space="preserve">5.4 </w:t>
       </w:r>
       <w:proofErr w:type="spellStart"/>
@@ -8621,14 +8618,7 @@
         <w:rPr>
           <w:cs/>
         </w:rPr>
-        <w:t>เพื่อวิเคราะห์ความสัมพันธ์</w:t>
-      </w:r>
-      <w:r>
-        <w:rPr>
-          <w:cs/>
-        </w:rPr>
-        <w:lastRenderedPageBreak/>
-        <w:t>ระหว่างคุณภาพภาพทางสถิติ (</w:t>
+        <w:t>เพื่อวิเคราะห์ความสัมพันธ์ระหว่างคุณภาพภาพทางสถิติ (</w:t>
       </w:r>
       <w:r>
         <w:t xml:space="preserve">Image Fidelity) </w:t>
@@ -8684,6 +8674,15 @@
         </w:rPr>
         <w:t>คือค่าความคลาดเคลื่อนกำลังสองเฉลี่ย</w:t>
       </w:r>
+    </w:p>
+    <w:p>
+      <w:pPr>
+        <w:tabs>
+          <w:tab w:val="left" w:pos="1080"/>
+        </w:tabs>
+        <w:ind w:left="1080" w:hanging="360"/>
+        <w:jc w:val="both"/>
+      </w:pPr>
     </w:p>
     <w:p>
       <w:pPr>
@@ -8765,6 +8764,12 @@
     </w:p>
     <w:p>
       <w:pPr>
+        <w:spacing w:before="60" w:after="60"/>
+        <w:jc w:val="center"/>
+      </w:pPr>
+    </w:p>
+    <w:p>
+      <w:pPr>
         <w:tabs>
           <w:tab w:val="left" w:pos="1080"/>
         </w:tabs>
@@ -9649,6 +9654,7 @@
         <w:rPr>
           <w:rFonts w:ascii="TH SarabunPSK" w:hAnsi="TH SarabunPSK" w:cs="TH SarabunPSK"/>
         </w:rPr>
+        <w:lastRenderedPageBreak/>
         <w:t>Accuracy (</w:t>
       </w:r>
       <w:r>
@@ -9761,7 +9767,6 @@
         <w:jc w:val="thaiDistribute"/>
       </w:pPr>
       <w:r>
-        <w:lastRenderedPageBreak/>
         <w:tab/>
         <w:t>Precision (</w:t>
       </w:r>
@@ -9807,6 +9812,12 @@
         </w:rPr>
         <w:t>เพื่อประเมินความน่าเชื่อถือเมื่อแบบจำลองแจ้งเตือนว่าพบโรค</w:t>
       </w:r>
+    </w:p>
+    <w:p>
+      <w:pPr>
+        <w:spacing w:before="60" w:after="60"/>
+        <w:jc w:val="thaiDistribute"/>
+      </w:pPr>
     </w:p>
     <w:p>
       <w:pPr>
@@ -9852,7 +9863,7 @@
     <w:p>
       <w:pPr>
         <w:spacing w:before="60" w:after="60"/>
-        <w:jc w:val="thaiDistribute"/>
+        <w:jc w:val="center"/>
       </w:pPr>
     </w:p>
     <w:p>
@@ -9915,6 +9926,12 @@
       <w:r>
         <w:t xml:space="preserve"> (False Negative)</w:t>
       </w:r>
+    </w:p>
+    <w:p>
+      <w:pPr>
+        <w:spacing w:before="60" w:after="60"/>
+        <w:jc w:val="thaiDistribute"/>
+      </w:pPr>
     </w:p>
     <w:p>
       <w:pPr>
@@ -10193,6 +10210,7 @@
         <w:rPr>
           <w:rFonts w:ascii="TH SarabunPSK" w:hAnsi="TH SarabunPSK" w:cs="TH SarabunPSK"/>
         </w:rPr>
+        <w:lastRenderedPageBreak/>
         <w:tab/>
       </w:r>
       <w:r>
@@ -10437,7 +10455,6 @@
         <w:rPr>
           <w:rFonts w:ascii="TH SarabunPSK" w:hAnsi="TH SarabunPSK" w:cs="TH SarabunPSK"/>
         </w:rPr>
-        <w:lastRenderedPageBreak/>
         <w:t xml:space="preserve">1.0 </w:t>
       </w:r>
       <w:r>
@@ -11202,6 +11219,15 @@
       <w:r>
         <w:t xml:space="preserve"> Tolerance</w:t>
       </w:r>
+    </w:p>
+    <w:p>
+      <w:pPr>
+        <w:tabs>
+          <w:tab w:val="left" w:pos="1080"/>
+        </w:tabs>
+        <w:ind w:left="1440" w:hanging="720"/>
+        <w:jc w:val="both"/>
+      </w:pPr>
     </w:p>
     <w:p>
       <w:pPr>
@@ -11261,6 +11287,12 @@
     </w:p>
     <w:p>
       <w:pPr>
+        <w:spacing w:before="60" w:after="60"/>
+        <w:jc w:val="center"/>
+      </w:pPr>
+    </w:p>
+    <w:p>
+      <w:pPr>
         <w:tabs>
           <w:tab w:val="left" w:pos="1080"/>
         </w:tabs>
@@ -11288,6 +11320,15 @@
         <w:t>:</w:t>
       </w:r>
       <w:proofErr w:type="gramEnd"/>
+    </w:p>
+    <w:p>
+      <w:pPr>
+        <w:tabs>
+          <w:tab w:val="left" w:pos="1080"/>
+        </w:tabs>
+        <w:ind w:left="1080" w:hanging="360"/>
+        <w:jc w:val="both"/>
+      </w:pPr>
     </w:p>
     <w:p>
       <w:pPr>
@@ -11409,90 +11450,105 @@
     </w:p>
     <w:p>
       <w:pPr>
+        <w:spacing w:before="60" w:after="60"/>
+        <w:jc w:val="center"/>
+      </w:pPr>
+    </w:p>
+    <w:p>
+      <w:pPr>
+        <w:ind w:left="1418" w:hanging="709"/>
+      </w:pPr>
+      <w:r>
+        <w:br w:type="page"/>
+      </w:r>
+      <w:r>
+        <w:lastRenderedPageBreak/>
+        <w:t>5.8.</w:t>
+      </w:r>
+      <w:r>
+        <w:t>3.</w:t>
+      </w:r>
+      <w:r>
+        <w:tab/>
+        <w:t>Intersection over Union (</w:t>
+      </w:r>
+      <w:proofErr w:type="spellStart"/>
+      <w:r>
+        <w:t>IoU</w:t>
+      </w:r>
+      <w:proofErr w:type="spellEnd"/>
+      <w:r>
+        <w:t xml:space="preserve">) </w:t>
+      </w:r>
+      <w:proofErr w:type="spellStart"/>
+      <w:r>
+        <w:t>และ</w:t>
+      </w:r>
+      <w:proofErr w:type="spellEnd"/>
+      <w:r>
+        <w:t xml:space="preserve"> Dice Coefficient: </w:t>
+      </w:r>
+      <w:proofErr w:type="spellStart"/>
+      <w:r>
+        <w:t>โดยที่</w:t>
+      </w:r>
+      <w:proofErr w:type="spellEnd"/>
+      <w:r>
+        <w:t xml:space="preserve"> </w:t>
+      </w:r>
+      <w:proofErr w:type="spellStart"/>
+      <w:r>
+        <w:t>Mτ</w:t>
+      </w:r>
+      <w:proofErr w:type="spellEnd"/>
+      <w:r>
+        <w:t xml:space="preserve"> = {(</w:t>
+      </w:r>
+      <w:proofErr w:type="spellStart"/>
+      <w:proofErr w:type="gramStart"/>
+      <w:r>
+        <w:t>x,y</w:t>
+      </w:r>
+      <w:proofErr w:type="spellEnd"/>
+      <w:proofErr w:type="gramEnd"/>
+      <w:r>
+        <w:t>) | H(</w:t>
+      </w:r>
+      <w:proofErr w:type="spellStart"/>
+      <w:proofErr w:type="gramStart"/>
+      <w:r>
+        <w:t>x,y</w:t>
+      </w:r>
+      <w:proofErr w:type="spellEnd"/>
+      <w:proofErr w:type="gramEnd"/>
+      <w:r>
+        <w:t xml:space="preserve">) ≥ τ · max(H)} </w:t>
+      </w:r>
+      <w:proofErr w:type="spellStart"/>
+      <w:r>
+        <w:t>ที่ระดับเกณฑ์การตัด</w:t>
+      </w:r>
+      <w:proofErr w:type="spellEnd"/>
+      <w:r>
+        <w:t xml:space="preserve"> τ = 0.3 </w:t>
+      </w:r>
+      <w:proofErr w:type="spellStart"/>
+      <w:r>
+        <w:t>และ</w:t>
+      </w:r>
+      <w:proofErr w:type="spellEnd"/>
+      <w:r>
+        <w:t xml:space="preserve"> τ = 0.5</w:t>
+      </w:r>
+    </w:p>
+    <w:p>
+      <w:pPr>
         <w:tabs>
           <w:tab w:val="left" w:pos="1080"/>
         </w:tabs>
         <w:ind w:left="1440" w:hanging="720"/>
         <w:jc w:val="both"/>
       </w:pPr>
-      <w:r>
-        <w:t>5.8.</w:t>
-      </w:r>
-      <w:r>
-        <w:t>3.</w:t>
-      </w:r>
-      <w:r>
-        <w:tab/>
-        <w:t>Intersection over Union (</w:t>
-      </w:r>
-      <w:proofErr w:type="spellStart"/>
-      <w:r>
-        <w:t>IoU</w:t>
-      </w:r>
-      <w:proofErr w:type="spellEnd"/>
-      <w:r>
-        <w:t xml:space="preserve">) </w:t>
-      </w:r>
-      <w:proofErr w:type="spellStart"/>
-      <w:r>
-        <w:t>และ</w:t>
-      </w:r>
-      <w:proofErr w:type="spellEnd"/>
-      <w:r>
-        <w:t xml:space="preserve"> Dice Coefficient: </w:t>
-      </w:r>
-      <w:proofErr w:type="spellStart"/>
-      <w:r>
-        <w:t>โดยที่</w:t>
-      </w:r>
-      <w:proofErr w:type="spellEnd"/>
-      <w:r>
-        <w:t xml:space="preserve"> </w:t>
-      </w:r>
-      <w:proofErr w:type="spellStart"/>
-      <w:r>
-        <w:t>Mτ</w:t>
-      </w:r>
-      <w:proofErr w:type="spellEnd"/>
-      <w:r>
-        <w:t xml:space="preserve"> = {(</w:t>
-      </w:r>
-      <w:proofErr w:type="spellStart"/>
-      <w:proofErr w:type="gramStart"/>
-      <w:r>
-        <w:t>x,y</w:t>
-      </w:r>
-      <w:proofErr w:type="spellEnd"/>
-      <w:proofErr w:type="gramEnd"/>
-      <w:r>
-        <w:t>) | H(</w:t>
-      </w:r>
-      <w:proofErr w:type="spellStart"/>
-      <w:proofErr w:type="gramStart"/>
-      <w:r>
-        <w:t>x,y</w:t>
-      </w:r>
-      <w:proofErr w:type="spellEnd"/>
-      <w:proofErr w:type="gramEnd"/>
-      <w:r>
-        <w:t xml:space="preserve">) ≥ τ · max(H)} </w:t>
-      </w:r>
-      <w:proofErr w:type="spellStart"/>
-      <w:r>
-        <w:t>ที่ระดับเกณฑ์การตัด</w:t>
-      </w:r>
-      <w:proofErr w:type="spellEnd"/>
-      <w:r>
-        <w:t xml:space="preserve"> τ = 0.3 </w:t>
-      </w:r>
-      <w:proofErr w:type="spellStart"/>
-      <w:r>
-        <w:t>และ</w:t>
-      </w:r>
-      <w:proofErr w:type="spellEnd"/>
-      <w:r>
-        <w:t xml:space="preserve"> τ = 0.5</w:t>
-      </w:r>
     </w:p>
     <w:p>
       <w:pPr>
@@ -11537,6 +11593,12 @@
     </w:p>
     <w:p>
       <w:pPr>
+        <w:spacing w:before="60" w:after="60"/>
+        <w:jc w:val="center"/>
+      </w:pPr>
+    </w:p>
+    <w:p>
+      <w:pPr>
         <w:ind w:firstLine="720"/>
         <w:jc w:val="thaiDistribute"/>
       </w:pPr>
@@ -11652,7 +11714,6 @@
         <w:ind w:left="360"/>
       </w:pPr>
       <w:r>
-        <w:lastRenderedPageBreak/>
         <w:t xml:space="preserve">5.9 </w:t>
       </w:r>
       <w:proofErr w:type="spellStart"/>
@@ -11731,8 +11792,14 @@
       </w:r>
     </w:p>
     <w:p>
+      <w:r>
+        <w:br w:type="page"/>
+      </w:r>
+    </w:p>
+    <w:p>
       <w:proofErr w:type="spellStart"/>
       <w:r>
+        <w:lastRenderedPageBreak/>
         <w:t>ผลการทดลองที่</w:t>
       </w:r>
       <w:proofErr w:type="spellEnd"/>
@@ -11755,6 +11822,7 @@
     </w:p>
     <w:p>
       <w:pPr>
+        <w:spacing w:after="240"/>
         <w:ind w:left="851" w:hanging="851"/>
         <w:jc w:val="thaiDistribute"/>
       </w:pPr>
@@ -17416,7 +17484,7 @@
     <w:p>
       <w:pPr>
         <w:keepNext/>
-        <w:spacing w:before="240"/>
+        <w:spacing w:before="240" w:after="240"/>
         <w:ind w:left="851" w:hanging="851"/>
         <w:jc w:val="thaiDistribute"/>
       </w:pPr>
@@ -23088,9 +23156,9 @@
         </w:rPr>
         <w:lastRenderedPageBreak/>
         <w:drawing>
-          <wp:inline distT="0" distB="0" distL="0" distR="0" wp14:anchorId="14B6004F" wp14:editId="2536A1A1">
-            <wp:extent cx="5238750" cy="3257550"/>
-            <wp:effectExtent l="0" t="0" r="0" b="0"/>
+          <wp:inline distT="0" distB="0" distL="0" distR="0" wp14:anchorId="14B6004F" wp14:editId="0AC4608D">
+            <wp:extent cx="5135880" cy="3193584"/>
+            <wp:effectExtent l="0" t="0" r="7620" b="6985"/>
             <wp:docPr id="2" name="fig2" descr="เมทริกซ์ความสับสน (Confusion Matrices) ของสภาวะตัวแทน 6 สภาวะในการทดลองที่ 1 บนชุดข้อมูล NIH ChestX-ray14" title="ภาพที่ 2"/>
             <wp:cNvGraphicFramePr>
               <a:graphicFrameLocks xmlns:a="http://schemas.openxmlformats.org/drawingml/2006/main" noChangeAspect="1"/>
@@ -23114,7 +23182,7 @@
                   <pic:spPr bwMode="auto">
                     <a:xfrm>
                       <a:off x="0" y="0"/>
-                      <a:ext cx="5238750" cy="3257550"/>
+                      <a:ext cx="5139132" cy="3195606"/>
                     </a:xfrm>
                     <a:prstGeom prst="rect">
                       <a:avLst/>
@@ -23129,8 +23197,9 @@
     </w:p>
     <w:p>
       <w:pPr>
-        <w:spacing w:after="240"/>
-        <w:jc w:val="center"/>
+        <w:spacing w:before="240" w:after="240"/>
+        <w:ind w:left="851" w:hanging="851"/>
+        <w:jc w:val="thaiDistribute"/>
       </w:pPr>
       <w:proofErr w:type="spellStart"/>
       <w:r>
@@ -23146,54 +23215,63 @@
           <w:b/>
           <w:bCs/>
         </w:rPr>
-        <w:t xml:space="preserve"> </w:t>
-      </w:r>
-      <w:proofErr w:type="gramStart"/>
-      <w:r>
-        <w:rPr>
-          <w:b/>
-          <w:bCs/>
-        </w:rPr>
-        <w:t>2</w:t>
-      </w:r>
-      <w:r>
-        <w:t xml:space="preserve">  </w:t>
+        <w:t xml:space="preserve"> 2</w:t>
+      </w:r>
+      <w:r>
+        <w:rPr>
+          <w:cs/>
+        </w:rPr>
+        <w:tab/>
+      </w:r>
+      <w:r>
+        <w:rPr>
+          <w:cs/>
+        </w:rPr>
+        <w:t>เมทริก</w:t>
       </w:r>
       <w:proofErr w:type="spellStart"/>
       <w:r>
-        <w:t>เมทริกซ์ความสับสน</w:t>
+        <w:rPr>
+          <w:cs/>
+        </w:rPr>
+        <w:t>ซ์</w:t>
       </w:r>
       <w:proofErr w:type="spellEnd"/>
-      <w:proofErr w:type="gramEnd"/>
-      <w:r>
-        <w:t xml:space="preserve"> (Confusion Matrices) </w:t>
-      </w:r>
-      <w:proofErr w:type="spellStart"/>
-      <w:r>
-        <w:t>ของสภาวะตัวแทน</w:t>
-      </w:r>
-      <w:proofErr w:type="spellEnd"/>
-      <w:r>
-        <w:t xml:space="preserve"> 6 </w:t>
-      </w:r>
-      <w:r>
-        <w:br/>
-      </w:r>
-      <w:proofErr w:type="spellStart"/>
-      <w:r>
-        <w:t>สภาวะในการทดลองที่</w:t>
-      </w:r>
-      <w:proofErr w:type="spellEnd"/>
-      <w:r>
-        <w:t xml:space="preserve"> 1 </w:t>
-      </w:r>
-      <w:proofErr w:type="spellStart"/>
-      <w:r>
-        <w:t>บนชุดข้อมูล</w:t>
-      </w:r>
-      <w:proofErr w:type="spellEnd"/>
-      <w:r>
-        <w:t xml:space="preserve"> NIH ChestX-ray14</w:t>
+      <w:r>
+        <w:rPr>
+          <w:cs/>
+        </w:rPr>
+        <w:t>ความสับสน (</w:t>
+      </w:r>
+      <w:r>
+        <w:t xml:space="preserve">Confusion Matrices) </w:t>
+      </w:r>
+      <w:r>
+        <w:rPr>
+          <w:cs/>
+        </w:rPr>
+        <w:t xml:space="preserve">ของสภาวะตัวแทน </w:t>
+      </w:r>
+      <w:r>
+        <w:t xml:space="preserve">6 </w:t>
+      </w:r>
+      <w:r>
+        <w:rPr>
+          <w:cs/>
+        </w:rPr>
+        <w:t xml:space="preserve">สภาวะในการทดลองที่ </w:t>
+      </w:r>
+      <w:r>
+        <w:t xml:space="preserve">1 </w:t>
+      </w:r>
+      <w:r>
+        <w:rPr>
+          <w:cs/>
+        </w:rPr>
+        <w:t xml:space="preserve">บนชุดข้อมูล </w:t>
+      </w:r>
+      <w:r>
+        <w:t>NIH ChestX-ray14</w:t>
       </w:r>
     </w:p>
     <w:p>
@@ -23207,9 +23285,9 @@
           <w:noProof/>
         </w:rPr>
         <w:drawing>
-          <wp:inline distT="0" distB="0" distL="0" distR="0" wp14:anchorId="3BE3698B" wp14:editId="1E54BAFC">
-            <wp:extent cx="5238750" cy="3257550"/>
-            <wp:effectExtent l="0" t="0" r="0" b="0"/>
+          <wp:inline distT="0" distB="0" distL="0" distR="0" wp14:anchorId="3BE3698B" wp14:editId="166CCAD7">
+            <wp:extent cx="4991100" cy="3103557"/>
+            <wp:effectExtent l="0" t="0" r="0" b="1905"/>
             <wp:docPr id="3" name="fig3" descr="เมทริกซ์ความสับสน (Confusion Matrices) ของสภาวะตัวแทน 6 สภาวะในการทดลองที่ 1 บนชุดข้อมูล VinBigData" title="ภาพที่ 3"/>
             <wp:cNvGraphicFramePr>
               <a:graphicFrameLocks xmlns:a="http://schemas.openxmlformats.org/drawingml/2006/main" noChangeAspect="1"/>
@@ -23233,7 +23311,7 @@
                   <pic:spPr bwMode="auto">
                     <a:xfrm>
                       <a:off x="0" y="0"/>
-                      <a:ext cx="5238750" cy="3257550"/>
+                      <a:ext cx="4993757" cy="3105209"/>
                     </a:xfrm>
                     <a:prstGeom prst="rect">
                       <a:avLst/>
@@ -23248,8 +23326,9 @@
     </w:p>
     <w:p>
       <w:pPr>
-        <w:spacing w:after="240"/>
-        <w:jc w:val="center"/>
+        <w:spacing w:before="240" w:after="240"/>
+        <w:ind w:left="851" w:hanging="851"/>
+        <w:jc w:val="thaiDistribute"/>
       </w:pPr>
       <w:proofErr w:type="spellStart"/>
       <w:r>
@@ -23265,38 +23344,29 @@
           <w:b/>
           <w:bCs/>
         </w:rPr>
+        <w:t xml:space="preserve"> 3</w:t>
+      </w:r>
+      <w:r>
+        <w:tab/>
+      </w:r>
+      <w:proofErr w:type="spellStart"/>
+      <w:r>
+        <w:t>เมทริกซ์ความสับสน</w:t>
+      </w:r>
+      <w:proofErr w:type="spellEnd"/>
+      <w:r>
+        <w:t xml:space="preserve"> (Confusion Matrices) </w:t>
+      </w:r>
+      <w:proofErr w:type="spellStart"/>
+      <w:r>
+        <w:t>ของสภาวะตัวแทน</w:t>
+      </w:r>
+      <w:proofErr w:type="spellEnd"/>
+      <w:r>
+        <w:t xml:space="preserve"> 6</w:t>
+      </w:r>
+      <w:r>
         <w:t xml:space="preserve"> </w:t>
-      </w:r>
-      <w:proofErr w:type="gramStart"/>
-      <w:r>
-        <w:rPr>
-          <w:b/>
-          <w:bCs/>
-        </w:rPr>
-        <w:t>3</w:t>
-      </w:r>
-      <w:r>
-        <w:t xml:space="preserve">  </w:t>
-      </w:r>
-      <w:proofErr w:type="spellStart"/>
-      <w:r>
-        <w:t>เมทริกซ์ความสับสน</w:t>
-      </w:r>
-      <w:proofErr w:type="spellEnd"/>
-      <w:proofErr w:type="gramEnd"/>
-      <w:r>
-        <w:t xml:space="preserve"> (Confusion Matrices) </w:t>
-      </w:r>
-      <w:proofErr w:type="spellStart"/>
-      <w:r>
-        <w:t>ของสภาวะตัวแทน</w:t>
-      </w:r>
-      <w:proofErr w:type="spellEnd"/>
-      <w:r>
-        <w:t xml:space="preserve"> 6</w:t>
-      </w:r>
-      <w:r>
-        <w:br/>
       </w:r>
       <w:proofErr w:type="spellStart"/>
       <w:r>
@@ -23324,7 +23394,7 @@
       <w:pPr>
         <w:keepNext/>
         <w:spacing w:before="60"/>
-        <w:ind w:left="720" w:hanging="720"/>
+        <w:ind w:left="720" w:hanging="862"/>
       </w:pPr>
       <w:proofErr w:type="spellStart"/>
       <w:r>
@@ -23353,7 +23423,7 @@
       <w:pPr>
         <w:keepNext/>
         <w:spacing w:after="120"/>
-        <w:ind w:left="709" w:hanging="851"/>
+        <w:ind w:left="851" w:hanging="993"/>
         <w:jc w:val="thaiDistribute"/>
       </w:pPr>
       <w:r>
@@ -27269,6 +27339,7 @@
         <w:keepNext/>
         <w:spacing w:after="120"/>
         <w:rPr>
+          <w:rFonts w:hint="cs"/>
           <w:b/>
           <w:bCs/>
         </w:rPr>
@@ -27277,9 +27348,10 @@
     <w:p>
       <w:pPr>
         <w:keepNext/>
-        <w:spacing w:after="120"/>
-        <w:ind w:left="851" w:hanging="851"/>
-        <w:rPr>
+        <w:spacing w:before="240" w:after="120"/>
+        <w:ind w:left="993" w:hanging="993"/>
+        <w:rPr>
+          <w:rFonts w:hint="cs"/>
           <w:cs/>
         </w:rPr>
       </w:pPr>
@@ -31665,8 +31737,8 @@
     <w:p>
       <w:pPr>
         <w:keepNext/>
-        <w:spacing w:before="240"/>
-        <w:ind w:left="851" w:hanging="851"/>
+        <w:spacing w:before="240" w:after="240"/>
+        <w:ind w:left="993" w:hanging="993"/>
         <w:rPr>
           <w:rFonts w:ascii="TH SarabunPSK" w:hAnsi="TH SarabunPSK" w:cs="TH SarabunPSK"/>
         </w:rPr>
@@ -31704,67 +31776,73 @@
         </w:rPr>
         <w:tab/>
       </w:r>
+      <w:r>
+        <w:rPr>
+          <w:rFonts w:ascii="TH SarabunPSK" w:hAnsi="TH SarabunPSK" w:cs="TH SarabunPSK" w:hint="cs"/>
+        </w:rPr>
+        <w:t xml:space="preserve">วิธีที่ให้ผลดีที่สุดแยกตามตระกูลสัญญาณรบกวน </w:t>
+      </w:r>
       <w:proofErr w:type="spellStart"/>
       <w:r>
         <w:rPr>
           <w:rFonts w:ascii="TH SarabunPSK" w:hAnsi="TH SarabunPSK" w:cs="TH SarabunPSK" w:hint="cs"/>
         </w:rPr>
-        <w:t>วิธีที่ให้ผลดีที่สุดแยกตามตระกูลสัญญาณรบกวน</w:t>
+        <w:t>เปรียบเทียบ</w:t>
       </w:r>
       <w:proofErr w:type="spellEnd"/>
       <w:r>
         <w:rPr>
           <w:rFonts w:ascii="TH SarabunPSK" w:hAnsi="TH SarabunPSK" w:cs="TH SarabunPSK" w:hint="cs"/>
         </w:rPr>
+        <w:t xml:space="preserve"> 2 </w:t>
+      </w:r>
+      <w:proofErr w:type="spellStart"/>
+      <w:r>
+        <w:rPr>
+          <w:rFonts w:ascii="TH SarabunPSK" w:hAnsi="TH SarabunPSK" w:cs="TH SarabunPSK" w:hint="cs"/>
+        </w:rPr>
+        <w:t>ชุดข้อมูล</w:t>
+      </w:r>
+      <w:proofErr w:type="spellEnd"/>
+      <w:r>
+        <w:rPr>
+          <w:rFonts w:ascii="TH SarabunPSK" w:hAnsi="TH SarabunPSK" w:cs="TH SarabunPSK"/>
+        </w:rPr>
         <w:t xml:space="preserve"> </w:t>
       </w:r>
+      <w:r>
+        <w:rPr>
+          <w:rFonts w:ascii="TH SarabunPSK" w:hAnsi="TH SarabunPSK" w:cs="TH SarabunPSK" w:hint="cs"/>
+        </w:rPr>
+        <w:t xml:space="preserve">(NIH </w:t>
+      </w:r>
       <w:proofErr w:type="spellStart"/>
       <w:r>
         <w:rPr>
           <w:rFonts w:ascii="TH SarabunPSK" w:hAnsi="TH SarabunPSK" w:cs="TH SarabunPSK" w:hint="cs"/>
         </w:rPr>
-        <w:t>เปรียบเทียบ</w:t>
+        <w:t>เปรียบเทียบด้วย</w:t>
       </w:r>
       <w:proofErr w:type="spellEnd"/>
       <w:r>
         <w:rPr>
           <w:rFonts w:ascii="TH SarabunPSK" w:hAnsi="TH SarabunPSK" w:cs="TH SarabunPSK" w:hint="cs"/>
         </w:rPr>
-        <w:t xml:space="preserve"> 2 </w:t>
+        <w:t xml:space="preserve"> </w:t>
       </w:r>
       <w:proofErr w:type="spellStart"/>
       <w:r>
         <w:rPr>
           <w:rFonts w:ascii="TH SarabunPSK" w:hAnsi="TH SarabunPSK" w:cs="TH SarabunPSK" w:hint="cs"/>
         </w:rPr>
-        <w:t>ชุดข้อมูล</w:t>
+        <w:t>ROC</w:t>
       </w:r>
       <w:proofErr w:type="spellEnd"/>
       <w:r>
         <w:rPr>
-          <w:rFonts w:ascii="TH SarabunPSK" w:hAnsi="TH SarabunPSK" w:cs="TH SarabunPSK"/>
-        </w:rPr>
-        <w:t xml:space="preserve"> </w:t>
-      </w:r>
-      <w:r>
-        <w:rPr>
           <w:rFonts w:ascii="TH SarabunPSK" w:hAnsi="TH SarabunPSK" w:cs="TH SarabunPSK" w:hint="cs"/>
         </w:rPr>
-        <w:t xml:space="preserve">(NIH </w:t>
-      </w:r>
-      <w:proofErr w:type="spellStart"/>
-      <w:r>
-        <w:rPr>
-          <w:rFonts w:ascii="TH SarabunPSK" w:hAnsi="TH SarabunPSK" w:cs="TH SarabunPSK" w:hint="cs"/>
-        </w:rPr>
-        <w:t>เปรียบเทียบด้วย</w:t>
-      </w:r>
-      <w:proofErr w:type="spellEnd"/>
-      <w:r>
-        <w:rPr>
-          <w:rFonts w:ascii="TH SarabunPSK" w:hAnsi="TH SarabunPSK" w:cs="TH SarabunPSK" w:hint="cs"/>
-        </w:rPr>
-        <w:t xml:space="preserve"> ROC-AUC; </w:t>
+        <w:t xml:space="preserve">-AUC; </w:t>
       </w:r>
       <w:proofErr w:type="spellStart"/>
       <w:r>
@@ -33386,7 +33464,7 @@
     <w:p>
       <w:pPr>
         <w:spacing w:after="240"/>
-        <w:jc w:val="center"/>
+        <w:ind w:left="709" w:hanging="709"/>
       </w:pPr>
       <w:proofErr w:type="spellStart"/>
       <w:r>
@@ -33402,67 +33480,69 @@
           <w:b/>
           <w:bCs/>
         </w:rPr>
-        <w:t xml:space="preserve"> </w:t>
-      </w:r>
-      <w:proofErr w:type="gramStart"/>
-      <w:r>
-        <w:rPr>
-          <w:b/>
-          <w:bCs/>
-        </w:rPr>
-        <w:t>4</w:t>
-      </w:r>
-      <w:r>
-        <w:t xml:space="preserve">  </w:t>
+        <w:t xml:space="preserve"> 4</w:t>
+      </w:r>
+      <w:r>
+        <w:tab/>
+      </w:r>
+      <w:r>
+        <w:rPr>
+          <w:cs/>
+        </w:rPr>
+        <w:t>เมทริก</w:t>
       </w:r>
       <w:proofErr w:type="spellStart"/>
       <w:r>
-        <w:t>เมทริกซ์ความสับสนรวม</w:t>
+        <w:rPr>
+          <w:cs/>
+        </w:rPr>
+        <w:t>ซ์</w:t>
       </w:r>
       <w:proofErr w:type="spellEnd"/>
-      <w:proofErr w:type="gramEnd"/>
-      <w:r>
-        <w:t xml:space="preserve"> 16 </w:t>
-      </w:r>
-      <w:proofErr w:type="spellStart"/>
-      <w:r>
-        <w:t>สภาวะ</w:t>
-      </w:r>
-      <w:proofErr w:type="spellEnd"/>
-      <w:r>
-        <w:t xml:space="preserve"> (1,600 </w:t>
-      </w:r>
-      <w:proofErr w:type="spellStart"/>
-      <w:r>
-        <w:t>การทำนายต่อวิธี</w:t>
-      </w:r>
-      <w:proofErr w:type="spellEnd"/>
-      <w:r>
-        <w:t xml:space="preserve">) </w:t>
-      </w:r>
-      <w:proofErr w:type="spellStart"/>
-      <w:r>
-        <w:t>ของ</w:t>
-      </w:r>
-      <w:proofErr w:type="spellEnd"/>
-      <w:r>
-        <w:t xml:space="preserve"> 4 </w:t>
-      </w:r>
-      <w:proofErr w:type="spellStart"/>
-      <w:r>
-        <w:t>วิธีสำคัญในการทดลองที่</w:t>
-      </w:r>
-      <w:proofErr w:type="spellEnd"/>
-      <w:r>
-        <w:t xml:space="preserve"> 2 </w:t>
-      </w:r>
-      <w:proofErr w:type="spellStart"/>
-      <w:r>
-        <w:t>บนชุดข้อมูล</w:t>
-      </w:r>
-      <w:proofErr w:type="spellEnd"/>
-      <w:r>
-        <w:t xml:space="preserve"> NIH ChestX-ray14</w:t>
+      <w:r>
+        <w:rPr>
+          <w:cs/>
+        </w:rPr>
+        <w:t xml:space="preserve">ความสับสนรวม </w:t>
+      </w:r>
+      <w:r>
+        <w:t xml:space="preserve">16 </w:t>
+      </w:r>
+      <w:r>
+        <w:rPr>
+          <w:cs/>
+        </w:rPr>
+        <w:t>สภาวะ (</w:t>
+      </w:r>
+      <w:r>
+        <w:t xml:space="preserve">1,600 </w:t>
+      </w:r>
+      <w:r>
+        <w:rPr>
+          <w:cs/>
+        </w:rPr>
+        <w:t xml:space="preserve">การทำนายต่อวิธี) ของ </w:t>
+      </w:r>
+      <w:r>
+        <w:t xml:space="preserve">4 </w:t>
+      </w:r>
+      <w:r>
+        <w:rPr>
+          <w:cs/>
+        </w:rPr>
+        <w:t xml:space="preserve">วิธีสำคัญในการทดลองที่ </w:t>
+      </w:r>
+      <w:r>
+        <w:t xml:space="preserve">2 </w:t>
+      </w:r>
+      <w:r>
+        <w:rPr>
+          <w:cs/>
+        </w:rPr>
+        <w:t xml:space="preserve">บนชุดข้อมูล </w:t>
+      </w:r>
+      <w:r>
+        <w:t>NIH ChestX-ray14</w:t>
       </w:r>
     </w:p>
     <w:p>
@@ -33517,8 +33597,8 @@
     </w:p>
     <w:p>
       <w:pPr>
-        <w:spacing w:after="240"/>
-        <w:jc w:val="center"/>
+        <w:spacing w:before="240" w:after="240"/>
+        <w:ind w:left="851" w:hanging="851"/>
       </w:pPr>
       <w:proofErr w:type="spellStart"/>
       <w:r>
@@ -33534,73 +33614,202 @@
           <w:b/>
           <w:bCs/>
         </w:rPr>
-        <w:t xml:space="preserve"> </w:t>
-      </w:r>
-      <w:proofErr w:type="gramStart"/>
-      <w:r>
+        <w:t xml:space="preserve"> 5</w:t>
+      </w:r>
+      <w:r>
+        <w:tab/>
+      </w:r>
+      <w:r>
+        <w:rPr>
+          <w:cs/>
+        </w:rPr>
+        <w:t>เมทริก</w:t>
+      </w:r>
+      <w:proofErr w:type="spellStart"/>
+      <w:r>
+        <w:rPr>
+          <w:cs/>
+        </w:rPr>
+        <w:t>ซ์</w:t>
+      </w:r>
+      <w:proofErr w:type="spellEnd"/>
+      <w:r>
+        <w:rPr>
+          <w:cs/>
+        </w:rPr>
+        <w:t xml:space="preserve">ความสับสนรวม </w:t>
+      </w:r>
+      <w:r>
+        <w:t xml:space="preserve">16 </w:t>
+      </w:r>
+      <w:r>
+        <w:rPr>
+          <w:cs/>
+        </w:rPr>
+        <w:t>สภาวะ (</w:t>
+      </w:r>
+      <w:r>
+        <w:t xml:space="preserve">1,600 </w:t>
+      </w:r>
+      <w:r>
+        <w:rPr>
+          <w:cs/>
+        </w:rPr>
+        <w:t xml:space="preserve">การทำนายต่อวิธี) ของ </w:t>
+      </w:r>
+      <w:r>
+        <w:t xml:space="preserve">4 </w:t>
+      </w:r>
+      <w:r>
+        <w:rPr>
+          <w:cs/>
+        </w:rPr>
+        <w:t xml:space="preserve">วิธีสำคัญในการทดลองที่ </w:t>
+      </w:r>
+      <w:r>
+        <w:t xml:space="preserve">2 </w:t>
+      </w:r>
+      <w:r>
+        <w:rPr>
+          <w:cs/>
+        </w:rPr>
+        <w:t xml:space="preserve">บนชุดข้อมูล </w:t>
+      </w:r>
+      <w:proofErr w:type="spellStart"/>
+      <w:r>
+        <w:t>VinBigData</w:t>
+      </w:r>
+      <w:proofErr w:type="spellEnd"/>
+    </w:p>
+    <w:p>
+      <w:pPr>
         <w:rPr>
           <w:b/>
           <w:bCs/>
-        </w:rPr>
-        <w:t>5</w:t>
-      </w:r>
-      <w:r>
-        <w:t xml:space="preserve">  </w:t>
-      </w:r>
-      <w:proofErr w:type="spellStart"/>
-      <w:r>
-        <w:t>เมทริกซ์ความสับสนรวม</w:t>
-      </w:r>
-      <w:proofErr w:type="spellEnd"/>
-      <w:proofErr w:type="gramEnd"/>
-      <w:r>
-        <w:t xml:space="preserve"> 16 </w:t>
-      </w:r>
-      <w:proofErr w:type="spellStart"/>
-      <w:r>
-        <w:t>สภาวะ</w:t>
-      </w:r>
-      <w:proofErr w:type="spellEnd"/>
-      <w:r>
-        <w:t xml:space="preserve"> (1,600 </w:t>
-      </w:r>
-      <w:proofErr w:type="spellStart"/>
-      <w:r>
-        <w:t>การทำนายต่อวิธี</w:t>
-      </w:r>
-      <w:proofErr w:type="spellEnd"/>
-      <w:r>
-        <w:t xml:space="preserve">) </w:t>
-      </w:r>
-      <w:proofErr w:type="spellStart"/>
-      <w:r>
-        <w:t>ของ</w:t>
-      </w:r>
-      <w:proofErr w:type="spellEnd"/>
-      <w:r>
-        <w:t xml:space="preserve"> 4 </w:t>
-      </w:r>
-      <w:proofErr w:type="spellStart"/>
-      <w:r>
-        <w:t>วิธีสำคัญในการทดลองที่</w:t>
-      </w:r>
-      <w:proofErr w:type="spellEnd"/>
-      <w:r>
-        <w:t xml:space="preserve"> 2 </w:t>
-      </w:r>
-      <w:proofErr w:type="spellStart"/>
-      <w:r>
-        <w:t>บนชุดข้อมูล</w:t>
-      </w:r>
-      <w:proofErr w:type="spellEnd"/>
-      <w:r>
-        <w:t xml:space="preserve"> </w:t>
-      </w:r>
-      <w:proofErr w:type="spellStart"/>
-      <w:r>
-        <w:t>VinBigData</w:t>
-      </w:r>
-      <w:proofErr w:type="spellEnd"/>
+          <w:cs/>
+        </w:rPr>
+      </w:pPr>
+      <w:r>
+        <w:rPr>
+          <w:b/>
+          <w:bCs/>
+          <w:cs/>
+        </w:rPr>
+        <w:br w:type="page"/>
+      </w:r>
+    </w:p>
+    <w:p>
+      <w:pPr>
+        <w:keepNext/>
+        <w:spacing w:before="240" w:after="120"/>
+        <w:jc w:val="thaiDistribute"/>
+        <w:rPr>
+          <w:rFonts w:ascii="TH SarabunPSK" w:hAnsi="TH SarabunPSK" w:cs="TH SarabunPSK" w:hint="cs"/>
+        </w:rPr>
+      </w:pPr>
+      <w:r>
+        <w:rPr>
+          <w:rFonts w:ascii="TH SarabunPSK" w:hAnsi="TH SarabunPSK" w:cs="TH SarabunPSK" w:hint="cs"/>
+          <w:cs/>
+        </w:rPr>
+        <w:lastRenderedPageBreak/>
+        <w:t xml:space="preserve">ผลการทดลองที่ </w:t>
+      </w:r>
+      <w:r>
+        <w:rPr>
+          <w:rFonts w:ascii="TH SarabunPSK" w:hAnsi="TH SarabunPSK" w:cs="TH SarabunPSK" w:hint="cs"/>
+        </w:rPr>
+        <w:t>2 (</w:t>
+      </w:r>
+      <w:r>
+        <w:rPr>
+          <w:rFonts w:ascii="TH SarabunPSK" w:hAnsi="TH SarabunPSK" w:cs="TH SarabunPSK" w:hint="cs"/>
+          <w:cs/>
+        </w:rPr>
+        <w:t xml:space="preserve">ต่อ): ความสัมพันธ์ระหว่างคุณภาพภาพกับประสิทธิภาพการจำแนกโรค — เพื่อตรวจสอบว่าค่า </w:t>
+      </w:r>
+      <w:r>
+        <w:rPr>
+          <w:rFonts w:ascii="TH SarabunPSK" w:hAnsi="TH SarabunPSK" w:cs="TH SarabunPSK" w:hint="cs"/>
+        </w:rPr>
+        <w:t xml:space="preserve">PSNR/SSIM </w:t>
+      </w:r>
+      <w:r>
+        <w:rPr>
+          <w:rFonts w:ascii="TH SarabunPSK" w:hAnsi="TH SarabunPSK" w:cs="TH SarabunPSK" w:hint="cs"/>
+          <w:cs/>
+        </w:rPr>
+        <w:t xml:space="preserve">ที่สูงขึ้นทำให้การจำแนกโรคดีขึ้นจริงหรือไม่ ผู้วิจัยเลือกสภาวะ </w:t>
+      </w:r>
+      <w:r>
+        <w:rPr>
+          <w:rFonts w:ascii="TH SarabunPSK" w:hAnsi="TH SarabunPSK" w:cs="TH SarabunPSK" w:hint="cs"/>
+        </w:rPr>
+        <w:t>Gaussian N3 (</w:t>
+      </w:r>
+      <w:r>
+        <w:rPr>
+          <w:rFonts w:ascii="Calibri" w:hAnsi="Calibri" w:cs="Calibri"/>
+        </w:rPr>
+        <w:t>σ</w:t>
+      </w:r>
+      <w:r>
+        <w:rPr>
+          <w:rFonts w:ascii="TH SarabunPSK" w:hAnsi="TH SarabunPSK" w:cs="TH SarabunPSK" w:hint="cs"/>
+        </w:rPr>
+        <w:t xml:space="preserve"> = 0.10) </w:t>
+      </w:r>
+      <w:r>
+        <w:rPr>
+          <w:rFonts w:ascii="TH SarabunPSK" w:hAnsi="TH SarabunPSK" w:cs="TH SarabunPSK" w:hint="cs"/>
+          <w:cs/>
+        </w:rPr>
+        <w:t xml:space="preserve">ซึ่งเป็นสัญญาณรบกวนระดับรุนแรงที่สุดของตระกูล </w:t>
+      </w:r>
+      <w:r>
+        <w:rPr>
+          <w:rFonts w:ascii="TH SarabunPSK" w:hAnsi="TH SarabunPSK" w:cs="TH SarabunPSK" w:hint="cs"/>
+        </w:rPr>
+        <w:t xml:space="preserve">Gaussian </w:t>
+      </w:r>
+      <w:r>
+        <w:rPr>
+          <w:rFonts w:ascii="TH SarabunPSK" w:hAnsi="TH SarabunPSK" w:cs="TH SarabunPSK" w:hint="cs"/>
+          <w:cs/>
+        </w:rPr>
+        <w:t>เป็นกรณีศึกษาตัวแทน โดยเปรียบเทียบภาพดิบ (</w:t>
+      </w:r>
+      <w:r>
+        <w:rPr>
+          <w:rFonts w:ascii="TH SarabunPSK" w:hAnsi="TH SarabunPSK" w:cs="TH SarabunPSK" w:hint="cs"/>
+        </w:rPr>
+        <w:t xml:space="preserve">Baseline), Median Filter L3 (7×7) </w:t>
+      </w:r>
+      <w:r>
+        <w:rPr>
+          <w:rFonts w:ascii="TH SarabunPSK" w:hAnsi="TH SarabunPSK" w:cs="TH SarabunPSK" w:hint="cs"/>
+          <w:cs/>
+        </w:rPr>
+        <w:t xml:space="preserve">และ </w:t>
+      </w:r>
+      <w:r>
+        <w:rPr>
+          <w:rFonts w:ascii="TH SarabunPSK" w:hAnsi="TH SarabunPSK" w:cs="TH SarabunPSK" w:hint="cs"/>
+        </w:rPr>
+        <w:t xml:space="preserve">DAE </w:t>
+      </w:r>
+      <w:r>
+        <w:rPr>
+          <w:rFonts w:ascii="Arial" w:hAnsi="Arial" w:cs="Arial"/>
+        </w:rPr>
+        <w:t>→</w:t>
+      </w:r>
+      <w:r>
+        <w:rPr>
+          <w:rFonts w:ascii="TH SarabunPSK" w:hAnsi="TH SarabunPSK" w:cs="TH SarabunPSK" w:hint="cs"/>
+        </w:rPr>
+        <w:t xml:space="preserve"> CLAHE</w:t>
+      </w:r>
     </w:p>
     <w:p>
       <w:pPr>
@@ -33614,7 +33823,6 @@
           <w:b/>
           <w:bCs/>
         </w:rPr>
-        <w:lastRenderedPageBreak/>
         <w:t>ตารางที่</w:t>
       </w:r>
       <w:proofErr w:type="spellEnd"/>
@@ -34792,7 +35000,7 @@
     <w:p>
       <w:pPr>
         <w:spacing w:after="240"/>
-        <w:jc w:val="center"/>
+        <w:ind w:left="851" w:hanging="851"/>
       </w:pPr>
       <w:proofErr w:type="spellStart"/>
       <w:r>
@@ -34808,25 +35016,19 @@
           <w:b/>
           <w:bCs/>
         </w:rPr>
+        <w:t xml:space="preserve"> 6</w:t>
+      </w:r>
+      <w:r>
         <w:t xml:space="preserve"> </w:t>
       </w:r>
-      <w:proofErr w:type="gramStart"/>
-      <w:r>
-        <w:rPr>
-          <w:b/>
-          <w:bCs/>
-        </w:rPr>
-        <w:t>6</w:t>
-      </w:r>
-      <w:r>
-        <w:t xml:space="preserve">  </w:t>
+      <w:r>
+        <w:tab/>
       </w:r>
       <w:proofErr w:type="spellStart"/>
       <w:r>
         <w:t>ความสัมพันธ์ระหว่างค่า</w:t>
       </w:r>
       <w:proofErr w:type="spellEnd"/>
-      <w:proofErr w:type="gramEnd"/>
       <w:r>
         <w:t xml:space="preserve"> PSNR </w:t>
       </w:r>
@@ -35126,6 +35328,7 @@
         <w:t xml:space="preserve">แต่ค่า </w:t>
       </w:r>
       <w:r>
+        <w:lastRenderedPageBreak/>
         <w:t xml:space="preserve">ROC-AUC </w:t>
       </w:r>
       <w:r>
@@ -35323,14 +35526,7 @@
         <w:rPr>
           <w:cs/>
         </w:rPr>
-        <w:t xml:space="preserve">สูงสุด </w:t>
-      </w:r>
-      <w:r>
-        <w:rPr>
-          <w:cs/>
-        </w:rPr>
-        <w:lastRenderedPageBreak/>
-        <w:t>(</w:t>
+        <w:t>สูงสุด (</w:t>
       </w:r>
       <w:r>
         <w:t xml:space="preserve">0.9800) </w:t>
@@ -36069,16 +36265,30 @@
     </w:p>
     <w:p>
       <w:pPr>
-        <w:keepNext/>
-        <w:spacing w:before="240" w:after="60"/>
-      </w:pPr>
-      <w:r>
         <w:rPr>
           <w:b/>
           <w:bCs/>
           <w:sz w:val="32"/>
           <w:szCs w:val="32"/>
         </w:rPr>
+      </w:pPr>
+      <w:r>
+        <w:rPr>
+          <w:b/>
+          <w:bCs/>
+          <w:sz w:val="32"/>
+          <w:szCs w:val="32"/>
+        </w:rPr>
+        <w:br w:type="page"/>
+      </w:r>
+      <w:r>
+        <w:rPr>
+          <w:b/>
+          <w:bCs/>
+          <w:sz w:val="32"/>
+          <w:szCs w:val="32"/>
+        </w:rPr>
+        <w:lastRenderedPageBreak/>
         <w:t xml:space="preserve">6. </w:t>
       </w:r>
       <w:proofErr w:type="spellStart"/>
@@ -36272,7 +36482,6 @@
         <w:rPr>
           <w:cs/>
         </w:rPr>
-        <w:lastRenderedPageBreak/>
         <w:t>และการรวมเทคนิค (</w:t>
       </w:r>
       <w:r>
@@ -36775,6 +36984,7 @@
         <w:jc w:val="thaiDistribute"/>
       </w:pPr>
       <w:r>
+        <w:lastRenderedPageBreak/>
         <w:t>6.3.</w:t>
       </w:r>
       <w:r>
@@ -36948,7 +37158,6 @@
           <w:sz w:val="32"/>
           <w:szCs w:val="32"/>
         </w:rPr>
-        <w:lastRenderedPageBreak/>
         <w:t xml:space="preserve">8. </w:t>
       </w:r>
       <w:proofErr w:type="spellStart"/>
@@ -37068,6 +37277,7 @@
           <w:sz w:val="32"/>
           <w:szCs w:val="32"/>
         </w:rPr>
+        <w:lastRenderedPageBreak/>
         <w:t xml:space="preserve">9. </w:t>
       </w:r>
       <w:proofErr w:type="spellStart"/>
@@ -39898,11 +40108,6 @@
     </w:tbl>
     <w:p>
       <w:pPr>
-        <w:spacing w:after="120"/>
-      </w:pPr>
-    </w:p>
-    <w:p>
-      <w:pPr>
         <w:keepNext/>
         <w:spacing w:before="240" w:after="60"/>
       </w:pPr>
@@ -39913,7 +40118,6 @@
           <w:sz w:val="32"/>
           <w:szCs w:val="32"/>
         </w:rPr>
-        <w:lastRenderedPageBreak/>
         <w:t xml:space="preserve">10. </w:t>
       </w:r>
       <w:proofErr w:type="spellStart"/>
@@ -40327,6 +40531,7 @@
           <w:sz w:val="32"/>
           <w:szCs w:val="32"/>
         </w:rPr>
+        <w:lastRenderedPageBreak/>
         <w:t xml:space="preserve">11. </w:t>
       </w:r>
       <w:proofErr w:type="spellStart"/>
@@ -40507,7 +40712,6 @@
         <w:jc w:val="thaiDistribute"/>
       </w:pPr>
       <w:r>
-        <w:lastRenderedPageBreak/>
         <w:t>Dhar, T., Dey, N., Borra, S., &amp; Sherratt, R. S. (2023). Challenges of deep learning in medical image analysis—Improving explainability and trust. IEEE Transactions on Technology and Society, 4(1), 68–75. https://doi.org/10.1109/TTS.2023.3234203</w:t>
       </w:r>
     </w:p>
@@ -40612,6 +40816,7 @@
         <w:jc w:val="thaiDistribute"/>
       </w:pPr>
       <w:r>
+        <w:lastRenderedPageBreak/>
         <w:t>Lundberg, S. M., &amp; Lee, S.-I. (2017). A unified approach to interpreting model predictions. In Advances in Neural Information Processing Systems (Vol. 30, pp. 4765–4774). https://doi.org/10.48550/arXiv.1705.07874</w:t>
       </w:r>
     </w:p>
@@ -40789,7 +40994,6 @@
         <w:jc w:val="thaiDistribute"/>
       </w:pPr>
       <w:r>
-        <w:lastRenderedPageBreak/>
         <w:t xml:space="preserve">Rudin, C. (2019). Stop explaining black box machine learning models for </w:t>
       </w:r>
       <w:proofErr w:type="gramStart"/>
@@ -40886,6 +41090,7 @@
         <w:jc w:val="thaiDistribute"/>
       </w:pPr>
       <w:r>
+        <w:lastRenderedPageBreak/>
         <w:t>Song, L., Sun, H., Xiao, H., Lam, S. K., Zhan, Y., Ren, G., &amp; Cai, J. (2025). Artificial intelligence for chest X-ray image enhancement. Radiation Medicine and Protection, 6(1), 61–68. https://doi.org/10.1016/j.radmp.2024.12.003</w:t>
       </w:r>
     </w:p>
@@ -41005,14 +41210,15 @@
     </w:p>
     <w:p>
       <w:pPr>
-        <w:jc w:val="right"/>
+        <w:rPr>
+          <w:cs/>
+        </w:rPr>
       </w:pPr>
       <w:r>
         <w:rPr>
           <w:cs/>
         </w:rPr>
-        <w:lastRenderedPageBreak/>
-        <w:t>ลงชื่อผู้ทำโครงงาน .............................................</w:t>
+        <w:br w:type="page"/>
       </w:r>
     </w:p>
     <w:p>
@@ -41020,27 +41226,25 @@
         <w:jc w:val="right"/>
       </w:pPr>
       <w:r>
+        <w:rPr>
+          <w:cs/>
+        </w:rPr>
+        <w:lastRenderedPageBreak/>
+        <w:t>ลงชื่อผู้ทำโครงงาน .............................................</w:t>
+      </w:r>
+    </w:p>
+    <w:p>
+      <w:pPr>
+        <w:jc w:val="right"/>
+      </w:pPr>
+      <w:r>
         <w:t>(</w:t>
       </w:r>
       <w:r>
         <w:rPr>
           <w:cs/>
         </w:rPr>
-        <w:t>นาย</w:t>
-      </w:r>
-      <w:proofErr w:type="spellStart"/>
-      <w:r>
-        <w:rPr>
-          <w:cs/>
-        </w:rPr>
-        <w:t>ปิ</w:t>
-      </w:r>
-      <w:proofErr w:type="spellEnd"/>
-      <w:r>
-        <w:rPr>
-          <w:cs/>
-        </w:rPr>
-        <w:t>ยะพล ตุ่นป่า)</w:t>
+        <w:t>นายสัพพัญญู คำตุ้ม)</w:t>
       </w:r>
       <w:r>
         <w:tab/>
@@ -41084,7 +41288,21 @@
         <w:rPr>
           <w:cs/>
         </w:rPr>
-        <w:t>นายสัพพัญญู คำตุ้ม)</w:t>
+        <w:t>นาย</w:t>
+      </w:r>
+      <w:proofErr w:type="spellStart"/>
+      <w:r>
+        <w:rPr>
+          <w:cs/>
+        </w:rPr>
+        <w:t>ปิ</w:t>
+      </w:r>
+      <w:proofErr w:type="spellEnd"/>
+      <w:r>
+        <w:rPr>
+          <w:cs/>
+        </w:rPr>
+        <w:t>ยะพล ตุ่นป่า)</w:t>
       </w:r>
       <w:r>
         <w:tab/>
@@ -41142,6 +41360,7 @@
         <w:t>อื่น ๆ .........................................................................................................................</w:t>
       </w:r>
     </w:p>
+    <w:p/>
     <w:p/>
     <w:p>
       <w:pPr>

</xml_diff>